<commit_message>
chore(fb-595.54.47): refresh Idaho and Washington generated engines
</commit_message>
<xml_diff>
--- a/courts/ninth-circuit/washington/state/court-of-appeals/motion-brief/usage/OUTPUT-motion-brief.docx
+++ b/courts/ninth-circuit/washington/state/court-of-appeals/motion-brief/usage/OUTPUT-motion-brief.docx
@@ -15676,7 +15676,7 @@
         <w:t xml:space="preserve"> </w:t>
       </w:r>
       <w:r>
-        <w:t xml:space="preserve">https://www.bjs.gov/​content/​pub/​pdf/​svjfry12.pdf</w:t>
+        <w:t xml:space="preserve">https://​​www.​bjs.​gov/​​content/​​pub/​​pdf/​​svjfry12.​pdf</w:t>
       </w:r>
     </w:p>
   </w:footnote>
@@ -15695,7 +15695,7 @@
         <w:t xml:space="preserve"> </w:t>
       </w:r>
       <w:r>
-        <w:t xml:space="preserve">https://usatoday30.usatoday.com/​news/​nation/2008</w:t>
+        <w:t xml:space="preserve">https://​​usatoday30.​usatoday.​com/​​news/​​nation/​​2008</w:t>
       </w:r>
       <w:r>
         <w:noBreakHyphen/>
@@ -15707,7 +15707,7 @@
         <w:noBreakHyphen/>
       </w:r>
       <w:r>
-        <w:t xml:space="preserve">02-juveniledetention_N.htm</w:t>
+        <w:t xml:space="preserve">02-​juveniledetention_N.​htm</w:t>
       </w:r>
     </w:p>
   </w:footnote>
@@ -15726,7 +15726,7 @@
         <w:t xml:space="preserve"> </w:t>
       </w:r>
       <w:r>
-        <w:t xml:space="preserve">http://www.justicepolicy.org/​research/1978</w:t>
+        <w:t xml:space="preserve">http://​​www.​justicepolicy.​org/​​research/​​1978</w:t>
       </w:r>
     </w:p>
   </w:footnote>
@@ -16468,6 +16468,7 @@
     <w:unhideWhenUsed/>
     <w:qFormat/>
     <w:pPr>
+      <w:keepLines/>
       <w:spacing w:before="0" w:after="140" w:line="322" w:lineRule="exact"/>
     </w:pPr>
     <w:rPr>

</xml_diff>